<commit_message>
changes to the user manual
</commit_message>
<xml_diff>
--- a/IBM SkillsBuild Gamification User Manual.docx
+++ b/IBM SkillsBuild Gamification User Manual.docx
@@ -47,13 +47,7 @@
         <w:t>introducing</w:t>
       </w:r>
       <w:r>
-        <w:t xml:space="preserve"> a leaderboard and </w:t>
-      </w:r>
-      <w:r>
-        <w:t>levelling</w:t>
-      </w:r>
-      <w:r>
-        <w:t xml:space="preserve"> system. It allows users to track their progress and encourages participation through a competitive learning environment. The software aims to make online learning more interactive and rewarding, focusing on students using IBM SkillsBuild to develop key skills in computer science.</w:t>
+        <w:t xml:space="preserve"> a leaderboard and levelling system. It allows users to track their progress and encourages participation through a competitive learning environment. The software aims to make online learning more interactive and rewarding, focusing on students using IBM SkillsBuild to develop key skills in computer science.</w:t>
       </w:r>
     </w:p>
     <w:p>
@@ -164,6 +158,9 @@
         <w:jc w:val="center"/>
       </w:pPr>
       <w:r>
+        <w:rPr>
+          <w:noProof/>
+        </w:rPr>
         <w:drawing>
           <wp:inline distT="0" distB="0" distL="0" distR="0" wp14:anchorId="1881B632" wp14:editId="70A824E1">
             <wp:extent cx="5560142" cy="1828947"/>
@@ -316,7 +313,13 @@
         </w:numPr>
       </w:pPr>
       <w:r>
-        <w:t>Clicking this button takes the user to the Leaderboard, where they can see rankings based on progress and achievements.</w:t>
+        <w:t xml:space="preserve">Clicking this button takes the user to the Leaderboard, where they can see rankings based on </w:t>
+      </w:r>
+      <w:r>
+        <w:t>the number of courses completed</w:t>
+      </w:r>
+      <w:r>
+        <w:t>.</w:t>
       </w:r>
     </w:p>
     <w:p>
@@ -374,6 +377,9 @@
         <w:ind w:left="1080"/>
       </w:pPr>
       <w:r>
+        <w:rPr>
+          <w:noProof/>
+        </w:rPr>
         <w:drawing>
           <wp:inline distT="0" distB="0" distL="0" distR="0" wp14:anchorId="1760471E" wp14:editId="4D14C1E9">
             <wp:extent cx="4626169" cy="2283870"/>
@@ -2716,6 +2722,7 @@
   <w:style w:type="character" w:default="1" w:styleId="DefaultParagraphFont">
     <w:name w:val="Default Paragraph Font"/>
     <w:uiPriority w:val="1"/>
+    <w:semiHidden/>
     <w:unhideWhenUsed/>
   </w:style>
   <w:style w:type="table" w:default="1" w:styleId="TableNormal">

</xml_diff>